<commit_message>
Update authors to include Samson
</commit_message>
<xml_diff>
--- a/report/CYBR500_Project4_Report.docx
+++ b/report/CYBR500_Project4_Report.docx
@@ -30,13 +30,13 @@
           <w:b/>
           <w:bCs/>
         </w:rPr>
-        <w:t xml:space="preserve">Author:</w:t>
-      </w:r>
-      <w:r>
-        <w:t xml:space="preserve"> </w:t>
-      </w:r>
-      <w:r>
-        <w:t xml:space="preserve">Shadman Ahsan</w:t>
+        <w:t xml:space="preserve">Authors:</w:t>
+      </w:r>
+      <w:r>
+        <w:t xml:space="preserve"> </w:t>
+      </w:r>
+      <w:r>
+        <w:t xml:space="preserve">Shadman Ahsan, Samson N. Tadesse</w:t>
       </w:r>
       <w:r>
         <w:br/>

</xml_diff>